<commit_message>
Refine Bioinformatics manuscript format and add main framework figure
</commit_message>
<xml_diff>
--- a/manuscript/ECMamba_supplementary_material.docx
+++ b/manuscript/ECMamba_supplementary_material.docx
@@ -2,7 +2,7 @@
 <file path=word/document.xml><?xml version="1.0" encoding="utf-8"?>
 <w:document xmlns:w="http://schemas.openxmlformats.org/wordprocessingml/2006/main" xmlns:m="http://schemas.openxmlformats.org/officeDocument/2006/math" xmlns:r="http://schemas.openxmlformats.org/officeDocument/2006/relationships" xmlns:o="urn:schemas-microsoft-com:office:office" xmlns:v="urn:schemas-microsoft-com:vml" xmlns:w10="urn:schemas-microsoft-com:office:word" xmlns:a="http://schemas.openxmlformats.org/drawingml/2006/main" xmlns:pic="http://schemas.openxmlformats.org/drawingml/2006/picture" xmlns:wp="http://schemas.openxmlformats.org/drawingml/2006/wordprocessingDrawing">
   <w:body>
-    <w:bookmarkStart w:id="22" w:name="supplementary-material-for-ecmamba"/>
+    <w:bookmarkStart w:id="26" w:name="supplementary-material-for-ecmamba"/>
     <w:p>
       <w:pPr>
         <w:pStyle w:val="Heading1"/>
@@ -105,7 +105,7 @@
       </w:r>
     </w:p>
     <w:bookmarkEnd w:id="11"/>
-    <w:bookmarkStart w:id="14" w:name="s4-extended-benchmark-tables"/>
+    <w:bookmarkStart w:id="18" w:name="s4-extended-benchmark-tables"/>
     <w:p>
       <w:pPr>
         <w:pStyle w:val="Heading2"/>
@@ -1182,14 +1182,13 @@
       </w:r>
     </w:p>
     <w:bookmarkEnd w:id="13"/>
-    <w:bookmarkEnd w:id="14"/>
-    <w:bookmarkStart w:id="18" w:name="s5-gated-fusion-equation"/>
-    <w:p>
-      <w:pPr>
-        <w:pStyle w:val="Heading2"/>
-      </w:pPr>
-      <w:r>
-        <w:t xml:space="preserve">S5 Gated-fusion equation</w:t>
+    <w:bookmarkStart w:id="17" w:name="figure-s1.-full-benchmark-comparison"/>
+    <w:p>
+      <w:pPr>
+        <w:pStyle w:val="Heading3"/>
+      </w:pPr>
+      <w:r>
+        <w:t xml:space="preserve">Figure S1. Full benchmark comparison</w:t>
       </w:r>
     </w:p>
     <w:p>
@@ -1199,20 +1198,86 @@
       <w:r>
         <w:drawing>
           <wp:inline>
-            <wp:extent cx="5334000" cy="976499"/>
+            <wp:extent cx="5334000" cy="2054062"/>
             <wp:effectExtent b="0" l="0" r="0" t="0"/>
-            <wp:docPr descr="Figure S1. Feature-wise gated fusion used in ECMamba." title="" id="16" name="Picture"/>
+            <wp:docPr descr="Figure S1. Benchmark comparison on NEW-392 and Price-149. ECMamba corresponds to the red series in the supplied composite figure." title="" id="15" name="Picture"/>
             <a:graphic>
               <a:graphicData uri="http://schemas.openxmlformats.org/drawingml/2006/picture">
                 <pic:pic>
                   <pic:nvPicPr>
-                    <pic:cNvPr descr="e:/研究/ECMamba/assets/ecmamba_gate_equation.png" id="17" name="Picture"/>
+                    <pic:cNvPr descr="e:/研究/ECMamba/model_comparison_full.png" id="16" name="Picture"/>
                     <pic:cNvPicPr>
                       <a:picLocks noChangeArrowheads="1" noChangeAspect="1"/>
                     </pic:cNvPicPr>
                   </pic:nvPicPr>
                   <pic:blipFill>
-                    <a:blip r:embed="rId15"/>
+                    <a:blip r:embed="rId14"/>
+                    <a:stretch>
+                      <a:fillRect/>
+                    </a:stretch>
+                  </pic:blipFill>
+                  <pic:spPr bwMode="auto">
+                    <a:xfrm>
+                      <a:off x="0" y="0"/>
+                      <a:ext cx="5334000" cy="2054062"/>
+                    </a:xfrm>
+                    <a:prstGeom prst="rect">
+                      <a:avLst/>
+                    </a:prstGeom>
+                    <a:noFill/>
+                    <a:ln w="9525">
+                      <a:noFill/>
+                      <a:headEnd/>
+                      <a:tailEnd/>
+                    </a:ln>
+                  </pic:spPr>
+                </pic:pic>
+              </a:graphicData>
+            </a:graphic>
+          </wp:inline>
+        </w:drawing>
+      </w:r>
+    </w:p>
+    <w:p>
+      <w:pPr>
+        <w:pStyle w:val="ImageCaption"/>
+      </w:pPr>
+      <w:r>
+        <w:t xml:space="preserve">Figure S1. Benchmark comparison on NEW-392 and Price-149. ECMamba corresponds to the red series in the supplied composite figure.</w:t>
+      </w:r>
+    </w:p>
+    <w:bookmarkEnd w:id="17"/>
+    <w:bookmarkEnd w:id="18"/>
+    <w:bookmarkStart w:id="22" w:name="s5-gated-fusion-equation"/>
+    <w:p>
+      <w:pPr>
+        <w:pStyle w:val="Heading2"/>
+      </w:pPr>
+      <w:r>
+        <w:t xml:space="preserve">S5 Gated-fusion equation</w:t>
+      </w:r>
+    </w:p>
+    <w:p>
+      <w:pPr>
+        <w:pStyle w:val="CaptionedFigure"/>
+      </w:pPr>
+      <w:r>
+        <w:drawing>
+          <wp:inline>
+            <wp:extent cx="5334000" cy="976499"/>
+            <wp:effectExtent b="0" l="0" r="0" t="0"/>
+            <wp:docPr descr="Figure S2. Feature-wise gated fusion used in ECMamba." title="" id="20" name="Picture"/>
+            <a:graphic>
+              <a:graphicData uri="http://schemas.openxmlformats.org/drawingml/2006/picture">
+                <pic:pic>
+                  <pic:nvPicPr>
+                    <pic:cNvPr descr="e:/研究/ECMamba/assets/ecmamba_gate_equation.png" id="21" name="Picture"/>
+                    <pic:cNvPicPr>
+                      <a:picLocks noChangeArrowheads="1" noChangeAspect="1"/>
+                    </pic:cNvPicPr>
+                  </pic:nvPicPr>
+                  <pic:blipFill>
+                    <a:blip r:embed="rId19"/>
                     <a:stretch>
                       <a:fillRect/>
                     </a:stretch>
@@ -1244,7 +1309,7 @@
         <w:pStyle w:val="ImageCaption"/>
       </w:pPr>
       <w:r>
-        <w:t xml:space="preserve">Figure S1. Feature-wise gated fusion used in ECMamba.</w:t>
+        <w:t xml:space="preserve">Figure S2. Feature-wise gated fusion used in ECMamba.</w:t>
       </w:r>
     </w:p>
     <w:p>
@@ -1255,8 +1320,8 @@
         <w:t xml:space="preserve">The gate is initialized with a positive bias so that optimization starts from a stable preference for pretrained sequence features and only later increases the contribution of explicit evolutionary evidence where useful.</w:t>
       </w:r>
     </w:p>
-    <w:bookmarkEnd w:id="18"/>
-    <w:bookmarkStart w:id="19" w:name="s6-projected-computational-profile"/>
+    <w:bookmarkEnd w:id="22"/>
+    <w:bookmarkStart w:id="23" w:name="s6-projected-computational-profile"/>
     <w:p>
       <w:pPr>
         <w:pStyle w:val="Heading2"/>
@@ -1528,8 +1593,8 @@
         <w:t xml:space="preserve">These values should not be presented as measured throughput. A submission that aims to claim efficiency should additionally report exact hardware, CUDA and PyTorch versions, trainable parameter count, sequence length distributions, padding efficiency, preprocessing cost and repeated-run variation.</w:t>
       </w:r>
     </w:p>
-    <w:bookmarkEnd w:id="19"/>
-    <w:bookmarkStart w:id="20" w:name="X96b6ef5d01b4166f218641fcedf4d7c80b65ad4"/>
+    <w:bookmarkEnd w:id="23"/>
+    <w:bookmarkStart w:id="24" w:name="X96b6ef5d01b4166f218641fcedf4d7c80b65ad4"/>
     <w:p>
       <w:pPr>
         <w:pStyle w:val="Heading2"/>
@@ -1659,8 +1724,8 @@
         <w:t xml:space="preserve">run_config.json</w:t>
       </w:r>
     </w:p>
-    <w:bookmarkEnd w:id="20"/>
-    <w:bookmarkStart w:id="21" w:name="s8-current-limitations"/>
+    <w:bookmarkEnd w:id="24"/>
+    <w:bookmarkStart w:id="25" w:name="s8-current-limitations"/>
     <w:p>
       <w:pPr>
         <w:pStyle w:val="Heading2"/>
@@ -1677,8 +1742,8 @@
         <w:t xml:space="preserve">The supplied materials do not yet include multi-seed uncertainty, significance testing, ablation of the MSA stream, fixed-weight fusion controls or gate-value analysis. The benchmark figure is therefore encouraging but not yet sufficient for strong mechanistic claims. A polished journal submission should add these controls together with the archived code snapshot and, ideally, measured runtime and memory statistics.</w:t>
       </w:r>
     </w:p>
-    <w:bookmarkEnd w:id="21"/>
-    <w:bookmarkEnd w:id="22"/>
+    <w:bookmarkEnd w:id="25"/>
+    <w:bookmarkEnd w:id="26"/>
     <w:sectPr>
       <w:footnotePr>
         <w:numRestart w:val="eachSect"/>

</xml_diff>